<commit_message>
avancement sur la base
</commit_message>
<xml_diff>
--- a/Notes/Note-technique.docx
+++ b/Notes/Note-technique.docx
@@ -67,33 +67,8 @@
           <w:szCs w:val="28"/>
         </w:rPr>
         <w:tab/>
-        <w:t>Gestion/</w:t>
-      </w:r>
-      <w:proofErr w:type="spellStart"/>
-      <w:r>
-        <w:rPr>
-          <w:sz w:val="28"/>
-          <w:szCs w:val="28"/>
-        </w:rPr>
-        <w:t>edition</w:t>
-      </w:r>
-      <w:proofErr w:type="spellEnd"/>
-      <w:r>
-        <w:rPr>
-          <w:sz w:val="28"/>
-          <w:szCs w:val="28"/>
-        </w:rPr>
-        <w:t xml:space="preserve"> de </w:t>
-      </w:r>
-      <w:proofErr w:type="spellStart"/>
-      <w:r>
-        <w:rPr>
-          <w:sz w:val="28"/>
-          <w:szCs w:val="28"/>
-        </w:rPr>
-        <w:t>buletins</w:t>
-      </w:r>
-      <w:proofErr w:type="spellEnd"/>
+        <w:t>Gestion/edition de buletins</w:t>
+      </w:r>
       <w:r>
         <w:rPr>
           <w:sz w:val="28"/>
@@ -143,80 +118,246 @@
           <w:sz w:val="28"/>
           <w:szCs w:val="28"/>
         </w:rPr>
-        <w:t xml:space="preserve"> , Copier variable dans </w:t>
-      </w:r>
-      <w:proofErr w:type="spellStart"/>
-      <w:r>
-        <w:rPr>
-          <w:sz w:val="28"/>
-          <w:szCs w:val="28"/>
-        </w:rPr>
-        <w:t>sadix</w:t>
-      </w:r>
-      <w:proofErr w:type="spellEnd"/>
-      <w:r>
-        <w:rPr>
-          <w:sz w:val="28"/>
-          <w:szCs w:val="28"/>
-        </w:rPr>
-        <w:t xml:space="preserve"> et coller dans IMP    importer IMP puis valider </w:t>
-      </w:r>
-    </w:p>
-    <w:p>
-      <w:pPr>
-        <w:rPr>
-          <w:sz w:val="28"/>
-          <w:szCs w:val="28"/>
-        </w:rPr>
-      </w:pPr>
-      <w:r>
-        <w:rPr>
-          <w:sz w:val="28"/>
-          <w:szCs w:val="28"/>
-        </w:rPr>
-        <w:t xml:space="preserve">Traiter </w:t>
-      </w:r>
-      <w:proofErr w:type="spellStart"/>
-      <w:r>
-        <w:rPr>
-          <w:sz w:val="28"/>
-          <w:szCs w:val="28"/>
-        </w:rPr>
-        <w:t>manulement</w:t>
-      </w:r>
-      <w:proofErr w:type="spellEnd"/>
-      <w:r>
-        <w:rPr>
-          <w:sz w:val="28"/>
-          <w:szCs w:val="28"/>
-        </w:rPr>
-        <w:t xml:space="preserve"> puis le </w:t>
-      </w:r>
-      <w:proofErr w:type="spellStart"/>
-      <w:r>
-        <w:rPr>
-          <w:sz w:val="28"/>
-          <w:szCs w:val="28"/>
-        </w:rPr>
-        <w:t>considerer</w:t>
-      </w:r>
-      <w:proofErr w:type="spellEnd"/>
-      <w:r>
-        <w:rPr>
-          <w:sz w:val="28"/>
-          <w:szCs w:val="28"/>
-        </w:rPr>
-        <w:t xml:space="preserve"> comme </w:t>
-      </w:r>
-      <w:proofErr w:type="spellStart"/>
-      <w:r>
-        <w:rPr>
-          <w:sz w:val="28"/>
-          <w:szCs w:val="28"/>
-        </w:rPr>
-        <w:t>reference</w:t>
-      </w:r>
-      <w:proofErr w:type="spellEnd"/>
+        <w:t xml:space="preserve"> , Copier variable dans sadix et coller dans IMP    importer IMP puis valider </w:t>
+      </w:r>
+    </w:p>
+    <w:p>
+      <w:pPr>
+        <w:rPr>
+          <w:sz w:val="28"/>
+          <w:szCs w:val="28"/>
+        </w:rPr>
+      </w:pPr>
+      <w:r>
+        <w:rPr>
+          <w:sz w:val="28"/>
+          <w:szCs w:val="28"/>
+        </w:rPr>
+        <w:t xml:space="preserve">Traiter manulement puis le </w:t>
+      </w:r>
+      <w:r>
+        <w:rPr>
+          <w:sz w:val="28"/>
+          <w:szCs w:val="28"/>
+        </w:rPr>
+        <w:t xml:space="preserve">considerer comme reference </w:t>
+      </w:r>
+    </w:p>
+    <w:p>
+      <w:pPr>
+        <w:rPr>
+          <w:sz w:val="28"/>
+          <w:szCs w:val="28"/>
+        </w:rPr>
+      </w:pPr>
+    </w:p>
+    <w:p>
+      <w:pPr>
+        <w:rPr>
+          <w:sz w:val="28"/>
+          <w:szCs w:val="28"/>
+        </w:rPr>
+      </w:pPr>
+      <w:r>
+        <w:rPr>
+          <w:sz w:val="28"/>
+          <w:szCs w:val="28"/>
+        </w:rPr>
+        <w:t xml:space="preserve">Rubrique de paie      </w:t>
+      </w:r>
+      <w:r>
+        <w:rPr>
+          <w:sz w:val="28"/>
+          <w:szCs w:val="28"/>
+        </w:rPr>
+        <w:t xml:space="preserve">dossier CMA_ &gt; </w:t>
+      </w:r>
+      <w:r>
+        <w:rPr>
+          <w:sz w:val="28"/>
+          <w:szCs w:val="28"/>
+        </w:rPr>
+        <w:t>IMP_RET_TEST</w:t>
+      </w:r>
+    </w:p>
+    <w:p>
+      <w:pPr>
+        <w:rPr>
+          <w:sz w:val="28"/>
+          <w:szCs w:val="28"/>
+        </w:rPr>
+      </w:pPr>
+      <w:r>
+        <w:rPr>
+          <w:sz w:val="28"/>
+          <w:szCs w:val="28"/>
+        </w:rPr>
+        <w:t>Verifier a rubrique sur 2 a 3 salaries pour etre certains que l’importation a marche</w:t>
+      </w:r>
+    </w:p>
+    <w:p>
+      <w:pPr>
+        <w:rPr>
+          <w:sz w:val="28"/>
+          <w:szCs w:val="28"/>
+        </w:rPr>
+      </w:pPr>
+    </w:p>
+    <w:p>
+      <w:pPr>
+        <w:rPr>
+          <w:sz w:val="28"/>
+          <w:szCs w:val="28"/>
+        </w:rPr>
+      </w:pPr>
+      <w:r>
+        <w:rPr>
+          <w:sz w:val="28"/>
+          <w:szCs w:val="28"/>
+        </w:rPr>
+        <w:t xml:space="preserve">Bull de paie,  selectionner ,recalculer </w:t>
+      </w:r>
+    </w:p>
+    <w:p>
+      <w:pPr>
+        <w:rPr>
+          <w:sz w:val="28"/>
+          <w:szCs w:val="28"/>
+        </w:rPr>
+      </w:pPr>
+    </w:p>
+    <w:p>
+      <w:pPr>
+        <w:rPr>
+          <w:sz w:val="28"/>
+          <w:szCs w:val="28"/>
+        </w:rPr>
+      </w:pPr>
+      <w:r>
+        <w:rPr>
+          <w:sz w:val="28"/>
+          <w:szCs w:val="28"/>
+        </w:rPr>
+        <w:t>Net du journal de paie et et net de LP_</w:t>
+      </w:r>
+      <w:r>
+        <w:rPr>
+          <w:sz w:val="28"/>
+          <w:szCs w:val="28"/>
+        </w:rPr>
+        <w:t xml:space="preserve"> de sage,</w:t>
+      </w:r>
+      <w:r>
+        <w:rPr>
+          <w:sz w:val="28"/>
+          <w:szCs w:val="28"/>
+        </w:rPr>
+        <w:t xml:space="preserve">   si c’est pas = , exporter </w:t>
+      </w:r>
+    </w:p>
+    <w:p>
+      <w:pPr>
+        <w:rPr>
+          <w:sz w:val="28"/>
+          <w:szCs w:val="28"/>
+        </w:rPr>
+      </w:pPr>
+      <w:r>
+        <w:rPr>
+          <w:sz w:val="28"/>
+          <w:szCs w:val="28"/>
+        </w:rPr>
+        <w:t xml:space="preserve">Ouvrir (Journal_paie…) recuperer matricule et montant puis comparer  </w:t>
+      </w:r>
+      <w:r>
+        <w:rPr>
+          <w:sz w:val="28"/>
+          <w:szCs w:val="28"/>
+        </w:rPr>
+        <w:t xml:space="preserve"> faire la difference</w:t>
+      </w:r>
+    </w:p>
+    <w:p>
+      <w:pPr>
+        <w:rPr>
+          <w:sz w:val="28"/>
+          <w:szCs w:val="28"/>
+        </w:rPr>
+      </w:pPr>
+    </w:p>
+    <w:p>
+      <w:pPr>
+        <w:rPr>
+          <w:sz w:val="28"/>
+          <w:szCs w:val="28"/>
+        </w:rPr>
+      </w:pPr>
+      <w:r>
+        <w:rPr>
+          <w:sz w:val="28"/>
+          <w:szCs w:val="28"/>
+        </w:rPr>
+        <w:t>Verifier  inserer 8511   sage  annexe duplicata</w:t>
+      </w:r>
+      <w:r>
+        <w:rPr>
+          <w:sz w:val="28"/>
+          <w:szCs w:val="28"/>
+        </w:rPr>
+        <w:t xml:space="preserve"> de bulletins/liste salaries </w:t>
+      </w:r>
+      <w:r>
+        <w:rPr>
+          <w:sz w:val="28"/>
+          <w:szCs w:val="28"/>
+        </w:rPr>
+        <w:t xml:space="preserve"> rechercher 511 ouvrir   </w:t>
+      </w:r>
+      <w:r>
+        <w:rPr>
+          <w:sz w:val="28"/>
+          <w:szCs w:val="28"/>
+        </w:rPr>
+        <w:t xml:space="preserve">toujours verifier d’abord le </w:t>
+      </w:r>
+      <w:r>
+        <w:rPr>
+          <w:color w:val="FF0000"/>
+          <w:sz w:val="28"/>
+          <w:szCs w:val="28"/>
+        </w:rPr>
+        <w:t>brut</w:t>
+      </w:r>
+      <w:r>
+        <w:rPr>
+          <w:sz w:val="28"/>
+          <w:szCs w:val="28"/>
+        </w:rPr>
+        <w:t xml:space="preserve">(sage/sadix) si ca correspond c’est  cotisation et impot le bleme </w:t>
+      </w:r>
+    </w:p>
+    <w:p>
+      <w:pPr>
+        <w:rPr>
+          <w:sz w:val="28"/>
+          <w:szCs w:val="28"/>
+        </w:rPr>
+      </w:pPr>
+    </w:p>
+    <w:p>
+      <w:pPr>
+        <w:rPr>
+          <w:sz w:val="28"/>
+          <w:szCs w:val="28"/>
+        </w:rPr>
+      </w:pPr>
+      <w:r>
+        <w:rPr>
+          <w:sz w:val="28"/>
+          <w:szCs w:val="28"/>
+        </w:rPr>
+        <w:t>y‘a eu des absences</w:t>
+      </w:r>
       <w:r>
         <w:rPr>
           <w:sz w:val="28"/>
@@ -224,486 +365,12 @@
         </w:rPr>
         <w:t xml:space="preserve"> </w:t>
       </w:r>
-    </w:p>
-    <w:p>
-      <w:pPr>
-        <w:rPr>
-          <w:sz w:val="28"/>
-          <w:szCs w:val="28"/>
-        </w:rPr>
-      </w:pPr>
-    </w:p>
-    <w:p>
-      <w:pPr>
-        <w:rPr>
-          <w:sz w:val="28"/>
-          <w:szCs w:val="28"/>
-        </w:rPr>
-      </w:pPr>
-      <w:r>
-        <w:rPr>
-          <w:sz w:val="28"/>
-          <w:szCs w:val="28"/>
-        </w:rPr>
-        <w:t xml:space="preserve">Rubrique de paie      </w:t>
-      </w:r>
-      <w:r>
-        <w:rPr>
-          <w:sz w:val="28"/>
-          <w:szCs w:val="28"/>
-        </w:rPr>
-        <w:t xml:space="preserve">dossier CMA_ &gt; </w:t>
-      </w:r>
-      <w:r>
-        <w:rPr>
-          <w:sz w:val="28"/>
-          <w:szCs w:val="28"/>
-        </w:rPr>
-        <w:t>IMP_RET_TEST</w:t>
-      </w:r>
-    </w:p>
-    <w:p>
-      <w:pPr>
-        <w:rPr>
-          <w:sz w:val="28"/>
-          <w:szCs w:val="28"/>
-        </w:rPr>
-      </w:pPr>
-      <w:proofErr w:type="spellStart"/>
-      <w:r>
-        <w:rPr>
-          <w:sz w:val="28"/>
-          <w:szCs w:val="28"/>
-        </w:rPr>
-        <w:t>Verifier</w:t>
-      </w:r>
-      <w:proofErr w:type="spellEnd"/>
-      <w:r>
-        <w:rPr>
-          <w:sz w:val="28"/>
-          <w:szCs w:val="28"/>
-        </w:rPr>
-        <w:t xml:space="preserve"> a rubrique sur 2 </w:t>
-      </w:r>
-      <w:proofErr w:type="spellStart"/>
-      <w:r>
-        <w:rPr>
-          <w:sz w:val="28"/>
-          <w:szCs w:val="28"/>
-        </w:rPr>
-        <w:t>a</w:t>
-      </w:r>
-      <w:proofErr w:type="spellEnd"/>
-      <w:r>
-        <w:rPr>
-          <w:sz w:val="28"/>
-          <w:szCs w:val="28"/>
-        </w:rPr>
-        <w:t xml:space="preserve"> 3 salaries pour </w:t>
-      </w:r>
-      <w:proofErr w:type="spellStart"/>
-      <w:r>
-        <w:rPr>
-          <w:sz w:val="28"/>
-          <w:szCs w:val="28"/>
-        </w:rPr>
-        <w:t>etre</w:t>
-      </w:r>
-      <w:proofErr w:type="spellEnd"/>
-      <w:r>
-        <w:rPr>
-          <w:sz w:val="28"/>
-          <w:szCs w:val="28"/>
-        </w:rPr>
-        <w:t xml:space="preserve"> certains que l’importation a marche</w:t>
-      </w:r>
-    </w:p>
-    <w:p>
-      <w:pPr>
-        <w:rPr>
-          <w:sz w:val="28"/>
-          <w:szCs w:val="28"/>
-        </w:rPr>
-      </w:pPr>
-    </w:p>
-    <w:p>
-      <w:pPr>
-        <w:rPr>
-          <w:sz w:val="28"/>
-          <w:szCs w:val="28"/>
-        </w:rPr>
-      </w:pPr>
-      <w:r>
-        <w:rPr>
-          <w:sz w:val="28"/>
-          <w:szCs w:val="28"/>
-        </w:rPr>
-        <w:t xml:space="preserve">Bull de paie,  </w:t>
-      </w:r>
-      <w:proofErr w:type="spellStart"/>
-      <w:r>
-        <w:rPr>
-          <w:sz w:val="28"/>
-          <w:szCs w:val="28"/>
-        </w:rPr>
-        <w:t>selectionner</w:t>
-      </w:r>
-      <w:proofErr w:type="spellEnd"/>
-      <w:r>
-        <w:rPr>
-          <w:sz w:val="28"/>
-          <w:szCs w:val="28"/>
-        </w:rPr>
-        <w:t xml:space="preserve"> ,recalculer </w:t>
-      </w:r>
-    </w:p>
-    <w:p>
-      <w:pPr>
-        <w:rPr>
-          <w:sz w:val="28"/>
-          <w:szCs w:val="28"/>
-        </w:rPr>
-      </w:pPr>
-    </w:p>
-    <w:p>
-      <w:pPr>
-        <w:rPr>
-          <w:sz w:val="28"/>
-          <w:szCs w:val="28"/>
-        </w:rPr>
-      </w:pPr>
-      <w:r>
-        <w:rPr>
-          <w:sz w:val="28"/>
-          <w:szCs w:val="28"/>
-        </w:rPr>
-        <w:t xml:space="preserve">Net du journal de paie et </w:t>
-      </w:r>
-      <w:proofErr w:type="spellStart"/>
-      <w:r>
-        <w:rPr>
-          <w:sz w:val="28"/>
-          <w:szCs w:val="28"/>
-        </w:rPr>
-        <w:t>et</w:t>
-      </w:r>
-      <w:proofErr w:type="spellEnd"/>
-      <w:r>
-        <w:rPr>
-          <w:sz w:val="28"/>
-          <w:szCs w:val="28"/>
-        </w:rPr>
-        <w:t xml:space="preserve"> net de LP_</w:t>
-      </w:r>
-      <w:r>
-        <w:rPr>
-          <w:sz w:val="28"/>
-          <w:szCs w:val="28"/>
-        </w:rPr>
-        <w:t xml:space="preserve"> de sage,</w:t>
-      </w:r>
-      <w:r>
-        <w:rPr>
-          <w:sz w:val="28"/>
-          <w:szCs w:val="28"/>
-        </w:rPr>
-        <w:t xml:space="preserve">   si c’est pas = , exporter </w:t>
-      </w:r>
-    </w:p>
-    <w:p>
-      <w:pPr>
-        <w:rPr>
-          <w:sz w:val="28"/>
-          <w:szCs w:val="28"/>
-        </w:rPr>
-      </w:pPr>
-      <w:r>
-        <w:rPr>
-          <w:sz w:val="28"/>
-          <w:szCs w:val="28"/>
-        </w:rPr>
-        <w:t>Ouvrir (</w:t>
-      </w:r>
-      <w:proofErr w:type="spellStart"/>
-      <w:r>
-        <w:rPr>
-          <w:sz w:val="28"/>
-          <w:szCs w:val="28"/>
-        </w:rPr>
-        <w:t>Journal_paie</w:t>
-      </w:r>
-      <w:proofErr w:type="spellEnd"/>
-      <w:r>
-        <w:rPr>
-          <w:sz w:val="28"/>
-          <w:szCs w:val="28"/>
-        </w:rPr>
-        <w:t xml:space="preserve">…) </w:t>
-      </w:r>
-      <w:proofErr w:type="spellStart"/>
-      <w:r>
-        <w:rPr>
-          <w:sz w:val="28"/>
-          <w:szCs w:val="28"/>
-        </w:rPr>
-        <w:t>recuperer</w:t>
-      </w:r>
-      <w:proofErr w:type="spellEnd"/>
-      <w:r>
-        <w:rPr>
-          <w:sz w:val="28"/>
-          <w:szCs w:val="28"/>
-        </w:rPr>
-        <w:t xml:space="preserve"> matricule et montant puis comparer  </w:t>
-      </w:r>
-      <w:r>
-        <w:rPr>
-          <w:sz w:val="28"/>
-          <w:szCs w:val="28"/>
-        </w:rPr>
-        <w:t xml:space="preserve"> faire la </w:t>
-      </w:r>
-      <w:proofErr w:type="spellStart"/>
-      <w:r>
-        <w:rPr>
-          <w:sz w:val="28"/>
-          <w:szCs w:val="28"/>
-        </w:rPr>
-        <w:t>difference</w:t>
-      </w:r>
-      <w:proofErr w:type="spellEnd"/>
-    </w:p>
-    <w:p>
-      <w:pPr>
-        <w:rPr>
-          <w:sz w:val="28"/>
-          <w:szCs w:val="28"/>
-        </w:rPr>
-      </w:pPr>
-    </w:p>
-    <w:p>
-      <w:pPr>
-        <w:rPr>
-          <w:sz w:val="28"/>
-          <w:szCs w:val="28"/>
-        </w:rPr>
-      </w:pPr>
-      <w:proofErr w:type="spellStart"/>
-      <w:r>
-        <w:rPr>
-          <w:sz w:val="28"/>
-          <w:szCs w:val="28"/>
-        </w:rPr>
-        <w:t>Verifier</w:t>
-      </w:r>
-      <w:proofErr w:type="spellEnd"/>
-      <w:r>
-        <w:rPr>
-          <w:sz w:val="28"/>
-          <w:szCs w:val="28"/>
-        </w:rPr>
-        <w:t xml:space="preserve">  </w:t>
-      </w:r>
-      <w:proofErr w:type="spellStart"/>
-      <w:r>
-        <w:rPr>
-          <w:sz w:val="28"/>
-          <w:szCs w:val="28"/>
-        </w:rPr>
-        <w:t>inserer</w:t>
-      </w:r>
-      <w:proofErr w:type="spellEnd"/>
-      <w:r>
-        <w:rPr>
-          <w:sz w:val="28"/>
-          <w:szCs w:val="28"/>
-        </w:rPr>
-        <w:t xml:space="preserve"> 8511   sage  annexe duplicata</w:t>
-      </w:r>
-      <w:r>
-        <w:rPr>
-          <w:sz w:val="28"/>
-          <w:szCs w:val="28"/>
-        </w:rPr>
-        <w:t xml:space="preserve"> de bulletins/liste salaries </w:t>
-      </w:r>
-      <w:r>
-        <w:rPr>
-          <w:sz w:val="28"/>
-          <w:szCs w:val="28"/>
-        </w:rPr>
-        <w:t xml:space="preserve"> rechercher 511 ouvrir   </w:t>
-      </w:r>
-      <w:r>
-        <w:rPr>
-          <w:sz w:val="28"/>
-          <w:szCs w:val="28"/>
-        </w:rPr>
-        <w:t xml:space="preserve">toujours </w:t>
-      </w:r>
-      <w:proofErr w:type="spellStart"/>
-      <w:r>
-        <w:rPr>
-          <w:sz w:val="28"/>
-          <w:szCs w:val="28"/>
-        </w:rPr>
-        <w:t>verifier</w:t>
-      </w:r>
-      <w:proofErr w:type="spellEnd"/>
-      <w:r>
-        <w:rPr>
-          <w:sz w:val="28"/>
-          <w:szCs w:val="28"/>
-        </w:rPr>
-        <w:t xml:space="preserve"> d’abord le </w:t>
-      </w:r>
-      <w:r>
-        <w:rPr>
-          <w:color w:val="FF0000"/>
-          <w:sz w:val="28"/>
-          <w:szCs w:val="28"/>
-        </w:rPr>
-        <w:t>brut</w:t>
-      </w:r>
-      <w:r>
-        <w:rPr>
-          <w:sz w:val="28"/>
-          <w:szCs w:val="28"/>
-        </w:rPr>
-        <w:t>(sage/</w:t>
-      </w:r>
-      <w:proofErr w:type="spellStart"/>
-      <w:r>
-        <w:rPr>
-          <w:sz w:val="28"/>
-          <w:szCs w:val="28"/>
-        </w:rPr>
-        <w:t>sadix</w:t>
-      </w:r>
-      <w:proofErr w:type="spellEnd"/>
-      <w:r>
-        <w:rPr>
-          <w:sz w:val="28"/>
-          <w:szCs w:val="28"/>
-        </w:rPr>
-        <w:t xml:space="preserve">) si </w:t>
-      </w:r>
-      <w:proofErr w:type="spellStart"/>
-      <w:r>
-        <w:rPr>
-          <w:sz w:val="28"/>
-          <w:szCs w:val="28"/>
-        </w:rPr>
-        <w:t>ca</w:t>
-      </w:r>
-      <w:proofErr w:type="spellEnd"/>
-      <w:r>
-        <w:rPr>
-          <w:sz w:val="28"/>
-          <w:szCs w:val="28"/>
-        </w:rPr>
-        <w:t xml:space="preserve"> correspond c’est  cotisation et </w:t>
-      </w:r>
-      <w:proofErr w:type="spellStart"/>
-      <w:r>
-        <w:rPr>
-          <w:sz w:val="28"/>
-          <w:szCs w:val="28"/>
-        </w:rPr>
-        <w:t>impot</w:t>
-      </w:r>
-      <w:proofErr w:type="spellEnd"/>
-      <w:r>
-        <w:rPr>
-          <w:sz w:val="28"/>
-          <w:szCs w:val="28"/>
-        </w:rPr>
-        <w:t xml:space="preserve"> le </w:t>
-      </w:r>
-      <w:proofErr w:type="spellStart"/>
-      <w:r>
-        <w:rPr>
-          <w:sz w:val="28"/>
-          <w:szCs w:val="28"/>
-        </w:rPr>
-        <w:t>bleme</w:t>
-      </w:r>
-      <w:proofErr w:type="spellEnd"/>
-      <w:r>
-        <w:rPr>
-          <w:sz w:val="28"/>
-          <w:szCs w:val="28"/>
-        </w:rPr>
-        <w:t xml:space="preserve"> </w:t>
-      </w:r>
-    </w:p>
-    <w:p>
-      <w:pPr>
-        <w:rPr>
-          <w:sz w:val="28"/>
-          <w:szCs w:val="28"/>
-        </w:rPr>
-      </w:pPr>
-    </w:p>
-    <w:p>
-      <w:pPr>
-        <w:rPr>
-          <w:sz w:val="28"/>
-          <w:szCs w:val="28"/>
-        </w:rPr>
-      </w:pPr>
-      <w:r>
-        <w:rPr>
-          <w:sz w:val="28"/>
-          <w:szCs w:val="28"/>
-        </w:rPr>
-        <w:t>y‘a eu des absences</w:t>
-      </w:r>
-      <w:r>
-        <w:rPr>
-          <w:sz w:val="28"/>
-          <w:szCs w:val="28"/>
-        </w:rPr>
-        <w:t xml:space="preserve"> </w:t>
-      </w:r>
-      <w:r>
-        <w:rPr>
-          <w:sz w:val="28"/>
-          <w:szCs w:val="28"/>
-        </w:rPr>
-        <w:t xml:space="preserve">  salarie : la </w:t>
-      </w:r>
-      <w:proofErr w:type="spellStart"/>
-      <w:r>
-        <w:rPr>
-          <w:sz w:val="28"/>
-          <w:szCs w:val="28"/>
-        </w:rPr>
-        <w:t>categorie</w:t>
-      </w:r>
-      <w:proofErr w:type="spellEnd"/>
-      <w:r>
-        <w:rPr>
-          <w:sz w:val="28"/>
-          <w:szCs w:val="28"/>
-        </w:rPr>
-        <w:t xml:space="preserve"> n’est pas </w:t>
-      </w:r>
-      <w:proofErr w:type="spellStart"/>
-      <w:r>
-        <w:rPr>
-          <w:sz w:val="28"/>
-          <w:szCs w:val="28"/>
-        </w:rPr>
-        <w:t>importe</w:t>
-      </w:r>
-      <w:proofErr w:type="spellEnd"/>
-      <w:r>
-        <w:rPr>
-          <w:sz w:val="28"/>
-          <w:szCs w:val="28"/>
-        </w:rPr>
-        <w:t xml:space="preserve"> ainsi que la convention</w:t>
+      <w:r>
+        <w:rPr>
+          <w:sz w:val="28"/>
+          <w:szCs w:val="28"/>
+        </w:rPr>
+        <w:t xml:space="preserve">  salarie : la categorie n’est pas importe ainsi que la convention</w:t>
       </w:r>
     </w:p>
     <w:p>
@@ -757,149 +424,53 @@
           <w:szCs w:val="28"/>
         </w:rPr>
         <w:lastRenderedPageBreak/>
-        <w:t xml:space="preserve">S’il y’a </w:t>
-      </w:r>
-      <w:proofErr w:type="spellStart"/>
-      <w:r>
-        <w:rPr>
-          <w:sz w:val="28"/>
-          <w:szCs w:val="28"/>
-        </w:rPr>
-        <w:t>differnce</w:t>
-      </w:r>
-      <w:proofErr w:type="spellEnd"/>
-      <w:r>
-        <w:rPr>
-          <w:sz w:val="28"/>
-          <w:szCs w:val="28"/>
-        </w:rPr>
-        <w:t xml:space="preserve"> -&gt;</w:t>
-      </w:r>
-    </w:p>
-    <w:p>
-      <w:pPr>
-        <w:rPr>
-          <w:sz w:val="28"/>
-          <w:szCs w:val="28"/>
-        </w:rPr>
-      </w:pPr>
-    </w:p>
-    <w:p>
-      <w:pPr>
-        <w:rPr>
-          <w:sz w:val="28"/>
-          <w:szCs w:val="28"/>
-        </w:rPr>
-      </w:pPr>
-      <w:r>
-        <w:rPr>
-          <w:sz w:val="28"/>
-          <w:szCs w:val="28"/>
-        </w:rPr>
-        <w:t xml:space="preserve">Niveau et </w:t>
-      </w:r>
-      <w:proofErr w:type="spellStart"/>
-      <w:r>
-        <w:rPr>
-          <w:sz w:val="28"/>
-          <w:szCs w:val="28"/>
-        </w:rPr>
-        <w:t>coeff</w:t>
-      </w:r>
-      <w:proofErr w:type="spellEnd"/>
-      <w:r>
-        <w:rPr>
-          <w:sz w:val="28"/>
-          <w:szCs w:val="28"/>
-        </w:rPr>
-        <w:t xml:space="preserve">  sage/</w:t>
-      </w:r>
-      <w:proofErr w:type="spellStart"/>
-      <w:r>
-        <w:rPr>
-          <w:sz w:val="28"/>
-          <w:szCs w:val="28"/>
-        </w:rPr>
-        <w:t>sadix</w:t>
-      </w:r>
-      <w:proofErr w:type="spellEnd"/>
-      <w:r>
-        <w:rPr>
-          <w:sz w:val="28"/>
-          <w:szCs w:val="28"/>
-        </w:rPr>
-        <w:t xml:space="preserve">   si </w:t>
-      </w:r>
-      <w:proofErr w:type="spellStart"/>
-      <w:r>
-        <w:rPr>
-          <w:sz w:val="28"/>
-          <w:szCs w:val="28"/>
-        </w:rPr>
-        <w:t>imcomplet</w:t>
-      </w:r>
-      <w:proofErr w:type="spellEnd"/>
-      <w:r>
-        <w:rPr>
-          <w:sz w:val="28"/>
-          <w:szCs w:val="28"/>
-        </w:rPr>
-        <w:t xml:space="preserve"> le </w:t>
-      </w:r>
-      <w:proofErr w:type="spellStart"/>
-      <w:r>
-        <w:rPr>
-          <w:sz w:val="28"/>
-          <w:szCs w:val="28"/>
-        </w:rPr>
-        <w:t>probleme</w:t>
-      </w:r>
-      <w:proofErr w:type="spellEnd"/>
-      <w:r>
-        <w:rPr>
-          <w:sz w:val="28"/>
-          <w:szCs w:val="28"/>
-        </w:rPr>
-        <w:t xml:space="preserve"> est l’IR </w:t>
-      </w:r>
-    </w:p>
-    <w:p>
-      <w:pPr>
-        <w:rPr>
-          <w:sz w:val="28"/>
-          <w:szCs w:val="28"/>
-        </w:rPr>
-      </w:pPr>
-    </w:p>
-    <w:p>
-      <w:pPr>
-        <w:rPr>
-          <w:sz w:val="28"/>
-          <w:szCs w:val="28"/>
-        </w:rPr>
-      </w:pPr>
-      <w:r>
-        <w:rPr>
-          <w:sz w:val="28"/>
-          <w:szCs w:val="28"/>
-        </w:rPr>
-        <w:t>Concepteur d’</w:t>
-      </w:r>
-      <w:proofErr w:type="spellStart"/>
-      <w:r>
-        <w:rPr>
-          <w:sz w:val="28"/>
-          <w:szCs w:val="28"/>
-        </w:rPr>
-        <w:t>etats</w:t>
-      </w:r>
-      <w:proofErr w:type="spellEnd"/>
-      <w:r>
-        <w:rPr>
-          <w:sz w:val="28"/>
-          <w:szCs w:val="28"/>
-        </w:rPr>
-        <w:t xml:space="preserve">  garder ce qu’on a besoin  </w:t>
+        <w:t>S’il y’a differnce -&gt;</w:t>
+      </w:r>
+    </w:p>
+    <w:p>
+      <w:pPr>
+        <w:rPr>
+          <w:sz w:val="28"/>
+          <w:szCs w:val="28"/>
+        </w:rPr>
+      </w:pPr>
+    </w:p>
+    <w:p>
+      <w:pPr>
+        <w:rPr>
+          <w:sz w:val="28"/>
+          <w:szCs w:val="28"/>
+        </w:rPr>
+      </w:pPr>
+      <w:r>
+        <w:rPr>
+          <w:sz w:val="28"/>
+          <w:szCs w:val="28"/>
+        </w:rPr>
+        <w:t xml:space="preserve">Niveau et coeff  sage/sadix   si imcomplet le probleme est l’IR </w:t>
+      </w:r>
+    </w:p>
+    <w:p>
+      <w:pPr>
+        <w:rPr>
+          <w:sz w:val="28"/>
+          <w:szCs w:val="28"/>
+        </w:rPr>
+      </w:pPr>
+    </w:p>
+    <w:p>
+      <w:pPr>
+        <w:rPr>
+          <w:sz w:val="28"/>
+          <w:szCs w:val="28"/>
+        </w:rPr>
+      </w:pPr>
+      <w:r>
+        <w:rPr>
+          <w:sz w:val="28"/>
+          <w:szCs w:val="28"/>
+        </w:rPr>
+        <w:t xml:space="preserve">Concepteur d’etats  garder ce qu’on a besoin  </w:t>
       </w:r>
     </w:p>
     <w:p>
@@ -917,23 +488,7 @@
           <w:sz w:val="28"/>
           <w:szCs w:val="28"/>
         </w:rPr>
-        <w:t xml:space="preserve">Formule logique  </w:t>
-      </w:r>
-      <w:proofErr w:type="spellStart"/>
-      <w:r>
-        <w:rPr>
-          <w:sz w:val="28"/>
-          <w:szCs w:val="28"/>
-        </w:rPr>
-        <w:t>inserer</w:t>
-      </w:r>
-      <w:proofErr w:type="spellEnd"/>
-      <w:r>
-        <w:rPr>
-          <w:sz w:val="28"/>
-          <w:szCs w:val="28"/>
-        </w:rPr>
-        <w:t xml:space="preserve"> la variable puis…</w:t>
+        <w:t>Formule logique  inserer la variable puis…</w:t>
       </w:r>
       <w:r>
         <w:rPr>
@@ -987,24 +542,16 @@
           <w:sz w:val="28"/>
           <w:szCs w:val="28"/>
         </w:rPr>
-        <w:t xml:space="preserve">Ou </w:t>
-      </w:r>
-      <w:proofErr w:type="spellStart"/>
-      <w:r>
-        <w:rPr>
-          <w:sz w:val="28"/>
-          <w:szCs w:val="28"/>
-        </w:rPr>
-        <w:t>recuperer</w:t>
-      </w:r>
-      <w:proofErr w:type="spellEnd"/>
-      <w:r>
-        <w:rPr>
-          <w:sz w:val="28"/>
-          <w:szCs w:val="28"/>
-        </w:rPr>
-        <w:t xml:space="preserve"> le LP et l’IMP ?</w:t>
-      </w:r>
+        <w:t>Ou recuperer le LP et l’IMP ?</w:t>
+      </w:r>
+    </w:p>
+    <w:p>
+      <w:pPr>
+        <w:rPr>
+          <w:sz w:val="28"/>
+          <w:szCs w:val="28"/>
+        </w:rPr>
+      </w:pPr>
     </w:p>
     <w:p>
       <w:pPr>
@@ -1191,23 +738,7 @@
           <w:sz w:val="28"/>
           <w:szCs w:val="28"/>
         </w:rPr>
-        <w:t xml:space="preserve">Envoi bulletins -&gt; </w:t>
-      </w:r>
-      <w:proofErr w:type="spellStart"/>
-      <w:r>
-        <w:rPr>
-          <w:sz w:val="28"/>
-          <w:szCs w:val="28"/>
-        </w:rPr>
-        <w:t>Employes</w:t>
-      </w:r>
-      <w:proofErr w:type="spellEnd"/>
-      <w:r>
-        <w:rPr>
-          <w:sz w:val="28"/>
-          <w:szCs w:val="28"/>
-        </w:rPr>
-        <w:t xml:space="preserve"> Paie</w:t>
+        <w:t>Envoi bulletins -&gt; Employes Paie</w:t>
       </w:r>
     </w:p>
     <w:p>
@@ -1516,23 +1047,7 @@
           <w:szCs w:val="28"/>
         </w:rPr>
         <w:lastRenderedPageBreak/>
-        <w:t xml:space="preserve">Créer une </w:t>
-      </w:r>
-      <w:proofErr w:type="spellStart"/>
-      <w:r>
-        <w:rPr>
-          <w:sz w:val="28"/>
-          <w:szCs w:val="28"/>
-        </w:rPr>
-        <w:t>societe</w:t>
-      </w:r>
-      <w:proofErr w:type="spellEnd"/>
-      <w:r>
-        <w:rPr>
-          <w:sz w:val="28"/>
-          <w:szCs w:val="28"/>
-        </w:rPr>
-        <w:t> :</w:t>
+        <w:t>Créer une societe :</w:t>
       </w:r>
     </w:p>
     <w:p>
@@ -1612,39 +1127,7 @@
           <w:sz w:val="28"/>
           <w:szCs w:val="28"/>
         </w:rPr>
-        <w:t xml:space="preserve">Cliquer sur le bouton ‘créer la </w:t>
-      </w:r>
-      <w:proofErr w:type="spellStart"/>
-      <w:r>
-        <w:rPr>
-          <w:sz w:val="28"/>
-          <w:szCs w:val="28"/>
-        </w:rPr>
-        <w:t>premiere</w:t>
-      </w:r>
-      <w:proofErr w:type="spellEnd"/>
-      <w:r>
-        <w:rPr>
-          <w:sz w:val="28"/>
-          <w:szCs w:val="28"/>
-        </w:rPr>
-        <w:t xml:space="preserve"> </w:t>
-      </w:r>
-      <w:proofErr w:type="spellStart"/>
-      <w:r>
-        <w:rPr>
-          <w:sz w:val="28"/>
-          <w:szCs w:val="28"/>
-        </w:rPr>
-        <w:t>societe</w:t>
-      </w:r>
-      <w:proofErr w:type="spellEnd"/>
-      <w:r>
-        <w:rPr>
-          <w:sz w:val="28"/>
-          <w:szCs w:val="28"/>
-        </w:rPr>
-        <w:t>’,</w:t>
+        <w:t>Cliquer sur le bouton ‘créer la premiere societe’,</w:t>
       </w:r>
     </w:p>
     <w:p>
@@ -1738,23 +1221,7 @@
           <w:sz w:val="28"/>
           <w:szCs w:val="28"/>
         </w:rPr>
-        <w:t xml:space="preserve">Ajouter une </w:t>
-      </w:r>
-      <w:proofErr w:type="spellStart"/>
-      <w:r>
-        <w:rPr>
-          <w:sz w:val="28"/>
-          <w:szCs w:val="28"/>
-        </w:rPr>
-        <w:t>societe</w:t>
-      </w:r>
-      <w:proofErr w:type="spellEnd"/>
-      <w:r>
-        <w:rPr>
-          <w:sz w:val="28"/>
-          <w:szCs w:val="28"/>
-        </w:rPr>
-        <w:t> :</w:t>
+        <w:t>Ajouter une societe :</w:t>
       </w:r>
     </w:p>
     <w:p>
@@ -1810,6 +1277,7 @@
     </w:p>
     <w:p>
       <w:pPr>
+        <w:jc w:val="center"/>
         <w:rPr>
           <w:sz w:val="28"/>
           <w:szCs w:val="28"/>
@@ -1872,15 +1340,13 @@
         </w:rPr>
         <w:t xml:space="preserve">Notre groupe ainsi que notre société a été </w:t>
       </w:r>
-      <w:proofErr w:type="spellStart"/>
-      <w:r>
-        <w:rPr>
-          <w:sz w:val="28"/>
-          <w:szCs w:val="28"/>
-        </w:rPr>
-        <w:t>crée</w:t>
-      </w:r>
-      <w:proofErr w:type="spellEnd"/>
+      <w:r>
+        <w:rPr>
+          <w:sz w:val="28"/>
+          <w:szCs w:val="28"/>
+        </w:rPr>
+        <w:t>créé</w:t>
+      </w:r>
       <w:r>
         <w:rPr>
           <w:sz w:val="28"/>
@@ -2375,22 +1841,13 @@
           <w:szCs w:val="28"/>
         </w:rPr>
       </w:pPr>
-      <w:proofErr w:type="spellStart"/>
       <w:r>
         <w:rPr>
           <w:sz w:val="28"/>
           <w:szCs w:val="28"/>
         </w:rPr>
         <w:lastRenderedPageBreak/>
-        <w:t>Creons</w:t>
-      </w:r>
-      <w:proofErr w:type="spellEnd"/>
-      <w:r>
-        <w:rPr>
-          <w:sz w:val="28"/>
-          <w:szCs w:val="28"/>
-        </w:rPr>
-        <w:t xml:space="preserve"> un Service pour une direction, en cliquant sur la direction puis Ajouter Service</w:t>
+        <w:t>Creons un Service pour une direction, en cliquant sur la direction puis Ajouter Service</w:t>
       </w:r>
       <w:r>
         <w:rPr>
@@ -2457,37 +1914,12 @@
           <w:szCs w:val="28"/>
         </w:rPr>
       </w:pPr>
-      <w:proofErr w:type="spellStart"/>
-      <w:r>
-        <w:rPr>
-          <w:sz w:val="28"/>
-          <w:szCs w:val="28"/>
-        </w:rPr>
-        <w:t>Creons</w:t>
-      </w:r>
-      <w:proofErr w:type="spellEnd"/>
-      <w:r>
-        <w:rPr>
-          <w:sz w:val="28"/>
-          <w:szCs w:val="28"/>
-        </w:rPr>
-        <w:t xml:space="preserve"> un poste bouton ‘Ajout Poste’ ou bien </w:t>
-      </w:r>
-      <w:proofErr w:type="spellStart"/>
-      <w:r>
-        <w:rPr>
-          <w:sz w:val="28"/>
-          <w:szCs w:val="28"/>
-        </w:rPr>
-        <w:t>selectionner</w:t>
-      </w:r>
-      <w:proofErr w:type="spellEnd"/>
-      <w:r>
-        <w:rPr>
-          <w:sz w:val="28"/>
-          <w:szCs w:val="28"/>
-        </w:rPr>
-        <w:t xml:space="preserve"> une Direction puis ‘</w:t>
+      <w:r>
+        <w:rPr>
+          <w:sz w:val="28"/>
+          <w:szCs w:val="28"/>
+        </w:rPr>
+        <w:t>Creons un poste bouton ‘Ajout Poste’ ou bien selectionner une Direction puis ‘</w:t>
       </w:r>
       <w:r>
         <w:rPr>
@@ -2654,22 +2086,13 @@
           <w:szCs w:val="28"/>
         </w:rPr>
       </w:pPr>
-      <w:proofErr w:type="spellStart"/>
       <w:r>
         <w:rPr>
           <w:sz w:val="28"/>
           <w:szCs w:val="28"/>
         </w:rPr>
         <w:lastRenderedPageBreak/>
-        <w:t>Creation</w:t>
-      </w:r>
-      <w:proofErr w:type="spellEnd"/>
-      <w:r>
-        <w:rPr>
-          <w:sz w:val="28"/>
-          <w:szCs w:val="28"/>
-        </w:rPr>
-        <w:t xml:space="preserve"> de salarie :</w:t>
+        <w:t>Creation de salarie :</w:t>
       </w:r>
     </w:p>
     <w:p>
@@ -3053,6 +2476,7 @@
       </w:pPr>
       <w:r>
         <w:rPr>
+          <w:noProof/>
           <w:sz w:val="28"/>
           <w:szCs w:val="28"/>
         </w:rPr>
@@ -3135,60 +2559,19 @@
           <w:szCs w:val="28"/>
         </w:rPr>
         <w:lastRenderedPageBreak/>
-        <w:t xml:space="preserve">La date retour est </w:t>
-      </w:r>
-      <w:r>
-        <w:rPr>
-          <w:sz w:val="28"/>
-          <w:szCs w:val="28"/>
-        </w:rPr>
-        <w:t>calculée</w:t>
-      </w:r>
-      <w:r>
-        <w:rPr>
-          <w:sz w:val="28"/>
-          <w:szCs w:val="28"/>
-        </w:rPr>
-        <w:t xml:space="preserve"> automatiquement </w:t>
-      </w:r>
-      <w:r>
-        <w:rPr>
-          <w:sz w:val="28"/>
-          <w:szCs w:val="28"/>
-        </w:rPr>
-        <w:t>à</w:t>
-      </w:r>
-      <w:r>
-        <w:rPr>
-          <w:sz w:val="28"/>
-          <w:szCs w:val="28"/>
-        </w:rPr>
-        <w:t xml:space="preserve"> partir de la date de </w:t>
-      </w:r>
-      <w:r>
-        <w:rPr>
-          <w:sz w:val="28"/>
-          <w:szCs w:val="28"/>
-        </w:rPr>
-        <w:t>début</w:t>
-      </w:r>
-      <w:r>
-        <w:rPr>
-          <w:sz w:val="28"/>
-          <w:szCs w:val="28"/>
-        </w:rPr>
-        <w:t xml:space="preserve"> et de fin.</w:t>
-      </w:r>
-    </w:p>
-    <w:p>
-      <w:pPr>
-        <w:rPr>
-          <w:sz w:val="28"/>
-          <w:szCs w:val="28"/>
-        </w:rPr>
-      </w:pPr>
-      <w:r>
-        <w:rPr>
+        <w:t>La date retour est calculée automatiquement à partir de la date de début et de fin.</w:t>
+      </w:r>
+    </w:p>
+    <w:p>
+      <w:pPr>
+        <w:rPr>
+          <w:sz w:val="28"/>
+          <w:szCs w:val="28"/>
+        </w:rPr>
+      </w:pPr>
+      <w:r>
+        <w:rPr>
+          <w:noProof/>
           <w:sz w:val="28"/>
           <w:szCs w:val="28"/>
         </w:rPr>
@@ -3236,6 +2619,14 @@
           <w:szCs w:val="28"/>
         </w:rPr>
       </w:pPr>
+    </w:p>
+    <w:p>
+      <w:pPr>
+        <w:rPr>
+          <w:sz w:val="28"/>
+          <w:szCs w:val="28"/>
+        </w:rPr>
+      </w:pPr>
       <w:r>
         <w:rPr>
           <w:sz w:val="28"/>
@@ -3306,23 +2697,8 @@
           <w:sz w:val="28"/>
           <w:szCs w:val="28"/>
         </w:rPr>
-        <w:t>Cliquer sur l’</w:t>
-      </w:r>
-      <w:proofErr w:type="spellStart"/>
-      <w:r>
-        <w:rPr>
-          <w:sz w:val="28"/>
-          <w:szCs w:val="28"/>
-        </w:rPr>
-        <w:t>employe</w:t>
-      </w:r>
-      <w:proofErr w:type="spellEnd"/>
-      <w:r>
-        <w:rPr>
-          <w:sz w:val="28"/>
-          <w:szCs w:val="28"/>
-        </w:rPr>
-        <w:t xml:space="preserve"> </w:t>
+        <w:lastRenderedPageBreak/>
+        <w:t xml:space="preserve">Cliquer sur l’employe </w:t>
       </w:r>
       <w:r>
         <w:rPr>
@@ -3352,7 +2728,6 @@
           <w:sz w:val="28"/>
           <w:szCs w:val="28"/>
         </w:rPr>
-        <w:lastRenderedPageBreak/>
         <w:drawing>
           <wp:inline distT="0" distB="0" distL="0" distR="0" wp14:anchorId="7B44687D" wp14:editId="1B85B870">
             <wp:extent cx="5760720" cy="1121410"/>
@@ -3512,21 +2887,12 @@
           <w:szCs w:val="28"/>
         </w:rPr>
       </w:pPr>
-      <w:proofErr w:type="spellStart"/>
-      <w:r>
-        <w:rPr>
-          <w:sz w:val="28"/>
-          <w:szCs w:val="28"/>
-        </w:rPr>
-        <w:t>Apercu</w:t>
-      </w:r>
-      <w:proofErr w:type="spellEnd"/>
-      <w:r>
-        <w:rPr>
-          <w:sz w:val="28"/>
-          <w:szCs w:val="28"/>
-        </w:rPr>
-        <w:t xml:space="preserve"> &amp; Impression :</w:t>
+      <w:r>
+        <w:rPr>
+          <w:sz w:val="28"/>
+          <w:szCs w:val="28"/>
+        </w:rPr>
+        <w:t>Apercu &amp; Impression :</w:t>
       </w:r>
     </w:p>
     <w:p>
@@ -3888,23 +3254,7 @@
           <w:sz w:val="28"/>
           <w:szCs w:val="28"/>
         </w:rPr>
-        <w:t xml:space="preserve">Page de </w:t>
-      </w:r>
-      <w:proofErr w:type="spellStart"/>
-      <w:r>
-        <w:rPr>
-          <w:sz w:val="28"/>
-          <w:szCs w:val="28"/>
-        </w:rPr>
-        <w:t>frmation</w:t>
-      </w:r>
-      <w:proofErr w:type="spellEnd"/>
-      <w:r>
-        <w:rPr>
-          <w:sz w:val="28"/>
-          <w:szCs w:val="28"/>
-        </w:rPr>
-        <w:t xml:space="preserve"> cliquons sur le bouton ‘PDC 2026’</w:t>
+        <w:t>Page de frmation cliquons sur le bouton ‘PDC 2026’</w:t>
       </w:r>
     </w:p>
     <w:p>
@@ -4515,21 +3865,12 @@
           <w:szCs w:val="28"/>
         </w:rPr>
       </w:pPr>
-      <w:proofErr w:type="spellStart"/>
-      <w:r>
-        <w:rPr>
-          <w:sz w:val="28"/>
-          <w:szCs w:val="28"/>
-        </w:rPr>
-        <w:t>Parametrage</w:t>
-      </w:r>
-      <w:proofErr w:type="spellEnd"/>
-      <w:r>
-        <w:rPr>
-          <w:sz w:val="28"/>
-          <w:szCs w:val="28"/>
-        </w:rPr>
-        <w:t xml:space="preserve"> -&gt; rubrique de paie,  dictionnaire de paie</w:t>
+      <w:r>
+        <w:rPr>
+          <w:sz w:val="28"/>
+          <w:szCs w:val="28"/>
+        </w:rPr>
+        <w:t>Parametrage -&gt; rubrique de paie,  dictionnaire de paie</w:t>
       </w:r>
     </w:p>
     <w:p>
@@ -4641,17 +3982,8 @@
           <w:sz w:val="28"/>
           <w:szCs w:val="28"/>
         </w:rPr>
-        <w:t>Recrutement &amp; Pré-</w:t>
-      </w:r>
-      <w:proofErr w:type="spellStart"/>
-      <w:r>
-        <w:rPr>
-          <w:sz w:val="28"/>
-          <w:szCs w:val="28"/>
-        </w:rPr>
-        <w:t>onboarding</w:t>
-      </w:r>
-      <w:proofErr w:type="spellEnd"/>
+        <w:t>Recrutement &amp; Pré-onboarding</w:t>
+      </w:r>
       <w:r>
         <w:rPr>
           <w:sz w:val="28"/>
@@ -4672,80 +4004,102 @@
           <w:sz w:val="28"/>
           <w:szCs w:val="28"/>
         </w:rPr>
-        <w:t xml:space="preserve">Recrutement -&gt; Appel </w:t>
-      </w:r>
-      <w:proofErr w:type="spellStart"/>
-      <w:r>
-        <w:rPr>
-          <w:sz w:val="28"/>
-          <w:szCs w:val="28"/>
-        </w:rPr>
-        <w:t>a</w:t>
-      </w:r>
-      <w:proofErr w:type="spellEnd"/>
-      <w:r>
-        <w:rPr>
-          <w:sz w:val="28"/>
-          <w:szCs w:val="28"/>
-        </w:rPr>
-        <w:t xml:space="preserve"> candidature    -   visite </w:t>
-      </w:r>
-      <w:proofErr w:type="spellStart"/>
-      <w:r>
-        <w:rPr>
-          <w:sz w:val="28"/>
-          <w:szCs w:val="28"/>
-        </w:rPr>
-        <w:t>medicale</w:t>
-      </w:r>
-      <w:proofErr w:type="spellEnd"/>
-      <w:r>
-        <w:rPr>
-          <w:sz w:val="28"/>
-          <w:szCs w:val="28"/>
-        </w:rPr>
-        <w:t xml:space="preserve">  -  Entretiens -&gt; Nouvelle campagne  -   GPEC  -  </w:t>
-      </w:r>
-    </w:p>
-    <w:p>
-      <w:pPr>
-        <w:rPr>
-          <w:sz w:val="28"/>
-          <w:szCs w:val="28"/>
-        </w:rPr>
-      </w:pPr>
-    </w:p>
-    <w:p>
-      <w:pPr>
-        <w:rPr>
-          <w:sz w:val="28"/>
-          <w:szCs w:val="28"/>
-        </w:rPr>
-      </w:pPr>
-    </w:p>
-    <w:p>
-      <w:pPr>
-        <w:rPr>
-          <w:sz w:val="28"/>
-          <w:szCs w:val="28"/>
-        </w:rPr>
-      </w:pPr>
-    </w:p>
-    <w:p>
-      <w:pPr>
-        <w:rPr>
-          <w:sz w:val="28"/>
-          <w:szCs w:val="28"/>
-        </w:rPr>
-      </w:pPr>
-    </w:p>
-    <w:p>
-      <w:pPr>
-        <w:rPr>
-          <w:sz w:val="28"/>
-          <w:szCs w:val="28"/>
-        </w:rPr>
-      </w:pPr>
+        <w:t xml:space="preserve">Recrutement -&gt; Appel a candidature    -   visite medicale  -  Entretiens -&gt; Nouvelle campagne  -   GPEC  -  </w:t>
+      </w:r>
+    </w:p>
+    <w:p>
+      <w:pPr>
+        <w:rPr>
+          <w:sz w:val="28"/>
+          <w:szCs w:val="28"/>
+        </w:rPr>
+      </w:pPr>
+    </w:p>
+    <w:p>
+      <w:pPr>
+        <w:rPr>
+          <w:sz w:val="28"/>
+          <w:szCs w:val="28"/>
+        </w:rPr>
+      </w:pPr>
+    </w:p>
+    <w:p>
+      <w:pPr>
+        <w:rPr>
+          <w:sz w:val="28"/>
+          <w:szCs w:val="28"/>
+        </w:rPr>
+      </w:pPr>
+    </w:p>
+    <w:p>
+      <w:pPr>
+        <w:rPr>
+          <w:sz w:val="28"/>
+          <w:szCs w:val="28"/>
+        </w:rPr>
+      </w:pPr>
+    </w:p>
+    <w:p>
+      <w:pPr>
+        <w:rPr>
+          <w:sz w:val="28"/>
+          <w:szCs w:val="28"/>
+        </w:rPr>
+      </w:pPr>
+      <w:hyperlink r:id="rId56" w:history="1">
+        <w:r>
+          <w:rPr>
+            <w:rStyle w:val="Lienhypertexte"/>
+            <w:sz w:val="28"/>
+            <w:szCs w:val="28"/>
+          </w:rPr>
+          <w:t>aida.diop@sadix-rh.com</w:t>
+        </w:r>
+      </w:hyperlink>
+      <w:r>
+        <w:rPr>
+          <w:sz w:val="28"/>
+          <w:szCs w:val="28"/>
+        </w:rPr>
+        <w:t xml:space="preserve">     </w:t>
+      </w:r>
+      <w:r>
+        <w:rPr>
+          <w:sz w:val="28"/>
+          <w:szCs w:val="28"/>
+        </w:rPr>
+        <w:t>Jj55SjmsWEC6</w:t>
+      </w:r>
+    </w:p>
+    <w:p>
+      <w:pPr>
+        <w:rPr>
+          <w:sz w:val="28"/>
+          <w:szCs w:val="28"/>
+        </w:rPr>
+      </w:pPr>
+      <w:r>
+        <w:rPr>
+          <w:sz w:val="28"/>
+          <w:szCs w:val="28"/>
+        </w:rPr>
+        <w:t>teCJMtKG9CVQ</w:t>
+      </w:r>
+    </w:p>
+    <w:p>
+      <w:pPr>
+        <w:rPr>
+          <w:sz w:val="28"/>
+          <w:szCs w:val="28"/>
+        </w:rPr>
+      </w:pPr>
+      <w:r>
+        <w:rPr>
+          <w:sz w:val="28"/>
+          <w:szCs w:val="28"/>
+        </w:rPr>
+        <w:t>masse salariale  =  salaire brut + chages patro + prime trans non imposable</w:t>
+      </w:r>
     </w:p>
     <w:sectPr>
       <w:pgSz w:w="11906" w:h="16838"/>

</xml_diff>